<commit_message>
Add new lecture materials for COMP469 AI Agents Foundations
- Added presentation slides for the following topics:
  - Introduction and Intelligent Agents (COMP469_AI_Agents_Foundations_Aug24_28.pptx)
  - Expanded Lecture for Chapters 1 and 2 (COMP469_Ch1_Ch2_Expanded_Lecture.pptx)
  - Full Lecture for Chapter 2 (COMP469_Ch2_Full_Lecture.pptx)

All files are added to the trash directory for review.
</commit_message>
<xml_diff>
--- a/Fall 2026/L01 - Introduction and Intelligent Agents/Chapter_1.docx
+++ b/Fall 2026/L01 - Introduction and Intelligent Agents/Chapter_1.docx
@@ -15,7 +15,10 @@
         </w:rPr>
       </w:pPr>
       <w:r>
-        <w:rPr/>
+        <w:rPr>
+          <w:sz w:val="16"/>
+          <w:szCs w:val="16"/>
+        </w:rPr>
       </w:r>
     </w:p>
     <w:p>
@@ -458,7 +461,10 @@
         </w:rPr>
       </w:pPr>
       <w:r>
-        <w:rPr/>
+        <w:rPr>
+          <w:sz w:val="16"/>
+          <w:szCs w:val="16"/>
+        </w:rPr>
       </w:r>
     </w:p>
     <w:p>
@@ -891,7 +897,10 @@
         </w:rPr>
       </w:pPr>
       <w:r>
-        <w:rPr/>
+        <w:rPr>
+          <w:sz w:val="16"/>
+          <w:szCs w:val="16"/>
+        </w:rPr>
       </w:r>
     </w:p>
     <w:p>
@@ -1285,7 +1294,10 @@
         </w:rPr>
       </w:pPr>
       <w:r>
-        <w:rPr/>
+        <w:rPr>
+          <w:sz w:val="16"/>
+          <w:szCs w:val="16"/>
+        </w:rPr>
       </w:r>
     </w:p>
     <w:p>
@@ -1757,7 +1769,10 @@
         </w:rPr>
       </w:pPr>
       <w:r>
-        <w:rPr/>
+        <w:rPr>
+          <w:sz w:val="16"/>
+          <w:szCs w:val="16"/>
+        </w:rPr>
       </w:r>
       <w:r>
         <w:br w:type="page"/>
@@ -1767,6 +1782,7 @@
       <w:pPr>
         <w:pStyle w:val="BodyText"/>
         <w:bidi w:val="0"/>
+        <w:spacing w:before="0" w:after="140"/>
         <w:ind w:hanging="0" w:start="0" w:end="0"/>
         <w:jc w:val="center"/>
         <w:rPr/>
@@ -2172,7 +2188,6 @@
           <w:numId w:val="1"/>
         </w:numPr>
         <w:tabs>
-          <w:tab w:val="clear" w:pos="709"/>
           <w:tab w:val="left" w:pos="709" w:leader="none"/>
         </w:tabs>
         <w:bidi w:val="0"/>
@@ -2205,7 +2220,6 @@
           <w:numId w:val="1"/>
         </w:numPr>
         <w:tabs>
-          <w:tab w:val="clear" w:pos="709"/>
           <w:tab w:val="left" w:pos="709" w:leader="none"/>
         </w:tabs>
         <w:bidi w:val="0"/>
@@ -2238,7 +2252,6 @@
           <w:numId w:val="1"/>
         </w:numPr>
         <w:tabs>
-          <w:tab w:val="clear" w:pos="709"/>
           <w:tab w:val="left" w:pos="709" w:leader="none"/>
         </w:tabs>
         <w:bidi w:val="0"/>
@@ -2271,7 +2284,6 @@
           <w:numId w:val="1"/>
         </w:numPr>
         <w:tabs>
-          <w:tab w:val="clear" w:pos="709"/>
           <w:tab w:val="left" w:pos="709" w:leader="none"/>
         </w:tabs>
         <w:bidi w:val="0"/>
@@ -2349,7 +2361,6 @@
           <w:numId w:val="2"/>
         </w:numPr>
         <w:tabs>
-          <w:tab w:val="clear" w:pos="709"/>
           <w:tab w:val="left" w:pos="709" w:leader="none"/>
         </w:tabs>
         <w:bidi w:val="0"/>
@@ -2382,7 +2393,6 @@
           <w:numId w:val="2"/>
         </w:numPr>
         <w:tabs>
-          <w:tab w:val="clear" w:pos="709"/>
           <w:tab w:val="left" w:pos="709" w:leader="none"/>
         </w:tabs>
         <w:bidi w:val="0"/>
@@ -2470,7 +2480,6 @@
           <w:numId w:val="3"/>
         </w:numPr>
         <w:tabs>
-          <w:tab w:val="clear" w:pos="709"/>
           <w:tab w:val="left" w:pos="709" w:leader="none"/>
         </w:tabs>
         <w:bidi w:val="0"/>
@@ -2503,7 +2512,6 @@
           <w:numId w:val="3"/>
         </w:numPr>
         <w:tabs>
-          <w:tab w:val="clear" w:pos="709"/>
           <w:tab w:val="left" w:pos="709" w:leader="none"/>
         </w:tabs>
         <w:bidi w:val="0"/>
@@ -2536,7 +2544,6 @@
           <w:numId w:val="3"/>
         </w:numPr>
         <w:tabs>
-          <w:tab w:val="clear" w:pos="709"/>
           <w:tab w:val="left" w:pos="709" w:leader="none"/>
         </w:tabs>
         <w:bidi w:val="0"/>
@@ -3425,7 +3432,6 @@
           <w:numId w:val="4"/>
         </w:numPr>
         <w:tabs>
-          <w:tab w:val="clear" w:pos="709"/>
           <w:tab w:val="left" w:pos="709" w:leader="none"/>
         </w:tabs>
         <w:bidi w:val="0"/>
@@ -3453,7 +3459,6 @@
           <w:numId w:val="4"/>
         </w:numPr>
         <w:tabs>
-          <w:tab w:val="clear" w:pos="709"/>
           <w:tab w:val="left" w:pos="709" w:leader="none"/>
         </w:tabs>
         <w:bidi w:val="0"/>
@@ -3481,7 +3486,6 @@
           <w:numId w:val="4"/>
         </w:numPr>
         <w:tabs>
-          <w:tab w:val="clear" w:pos="709"/>
           <w:tab w:val="left" w:pos="709" w:leader="none"/>
         </w:tabs>
         <w:bidi w:val="0"/>
@@ -3509,7 +3513,6 @@
           <w:numId w:val="4"/>
         </w:numPr>
         <w:tabs>
-          <w:tab w:val="clear" w:pos="709"/>
           <w:tab w:val="left" w:pos="709" w:leader="none"/>
         </w:tabs>
         <w:bidi w:val="0"/>
@@ -4331,7 +4334,6 @@
           <w:numId w:val="5"/>
         </w:numPr>
         <w:tabs>
-          <w:tab w:val="clear" w:pos="709"/>
           <w:tab w:val="left" w:pos="709" w:leader="none"/>
         </w:tabs>
         <w:bidi w:val="0"/>
@@ -4359,7 +4361,6 @@
           <w:numId w:val="5"/>
         </w:numPr>
         <w:tabs>
-          <w:tab w:val="clear" w:pos="709"/>
           <w:tab w:val="left" w:pos="709" w:leader="none"/>
         </w:tabs>
         <w:bidi w:val="0"/>
@@ -4387,7 +4388,6 @@
           <w:numId w:val="5"/>
         </w:numPr>
         <w:tabs>
-          <w:tab w:val="clear" w:pos="709"/>
           <w:tab w:val="left" w:pos="709" w:leader="none"/>
         </w:tabs>
         <w:bidi w:val="0"/>
@@ -4838,7 +4838,6 @@
           <w:numId w:val="6"/>
         </w:numPr>
         <w:tabs>
-          <w:tab w:val="clear" w:pos="709"/>
           <w:tab w:val="left" w:pos="709" w:leader="none"/>
         </w:tabs>
         <w:bidi w:val="0"/>
@@ -4866,7 +4865,6 @@
           <w:numId w:val="6"/>
         </w:numPr>
         <w:tabs>
-          <w:tab w:val="clear" w:pos="709"/>
           <w:tab w:val="left" w:pos="709" w:leader="none"/>
         </w:tabs>
         <w:bidi w:val="0"/>
@@ -4894,7 +4892,6 @@
           <w:numId w:val="6"/>
         </w:numPr>
         <w:tabs>
-          <w:tab w:val="clear" w:pos="709"/>
           <w:tab w:val="left" w:pos="709" w:leader="none"/>
         </w:tabs>
         <w:bidi w:val="0"/>
@@ -5268,7 +5265,6 @@
           <w:numId w:val="7"/>
         </w:numPr>
         <w:tabs>
-          <w:tab w:val="clear" w:pos="709"/>
           <w:tab w:val="left" w:pos="709" w:leader="none"/>
         </w:tabs>
         <w:bidi w:val="0"/>
@@ -5881,14 +5877,7 @@
           <w:sz w:val="16"/>
           <w:szCs w:val="16"/>
         </w:rPr>
-        <w:t>1</w:t>
-      </w:r>
-      <w:r>
-        <w:rPr>
-          <w:sz w:val="16"/>
-          <w:szCs w:val="16"/>
-        </w:rPr>
-        <w:t>.2.5 Psychology</w:t>
+        <w:t>1.2.5 Psychology</w:t>
       </w:r>
     </w:p>
     <w:p>
@@ -5899,7 +5888,6 @@
           <w:numId w:val="8"/>
         </w:numPr>
         <w:tabs>
-          <w:tab w:val="clear" w:pos="709"/>
           <w:tab w:val="left" w:pos="709" w:leader="none"/>
         </w:tabs>
         <w:bidi w:val="0"/>
@@ -6358,7 +6346,6 @@
           <w:numId w:val="9"/>
         </w:numPr>
         <w:tabs>
-          <w:tab w:val="clear" w:pos="709"/>
           <w:tab w:val="left" w:pos="709" w:leader="none"/>
         </w:tabs>
         <w:bidi w:val="0"/>
@@ -6724,7 +6711,6 @@
           <w:numId w:val="10"/>
         </w:numPr>
         <w:tabs>
-          <w:tab w:val="clear" w:pos="709"/>
           <w:tab w:val="left" w:pos="709" w:leader="none"/>
         </w:tabs>
         <w:bidi w:val="0"/>
@@ -6934,7 +6920,6 @@
           <w:numId w:val="11"/>
         </w:numPr>
         <w:tabs>
-          <w:tab w:val="clear" w:pos="709"/>
           <w:tab w:val="left" w:pos="709" w:leader="none"/>
         </w:tabs>
         <w:bidi w:val="0"/>
@@ -7671,7 +7656,7 @@
     </w:p>
     <w:p>
       <w:pPr>
-        <w:pStyle w:val="BlockQuotation"/>
+        <w:pStyle w:val="BlockQuotationuser"/>
         <w:bidi w:val="0"/>
         <w:jc w:val="start"/>
         <w:rPr>
@@ -8055,7 +8040,7 @@
     </w:p>
     <w:p>
       <w:pPr>
-        <w:pStyle w:val="BlockQuotation"/>
+        <w:pStyle w:val="BlockQuotationuser"/>
         <w:bidi w:val="0"/>
         <w:jc w:val="start"/>
         <w:rPr>
@@ -8385,7 +8370,7 @@
     </w:p>
     <w:p>
       <w:pPr>
-        <w:pStyle w:val="BlockQuotation"/>
+        <w:pStyle w:val="BlockQuotationuser"/>
         <w:bidi w:val="0"/>
         <w:jc w:val="start"/>
         <w:rPr>
@@ -9067,7 +9052,7 @@
     </w:p>
     <w:p>
       <w:pPr>
-        <w:pStyle w:val="BlockQuotation"/>
+        <w:pStyle w:val="BlockQuotationuser"/>
         <w:bidi w:val="0"/>
         <w:jc w:val="start"/>
         <w:rPr>
@@ -9737,7 +9722,6 @@
           <w:numId w:val="12"/>
         </w:numPr>
         <w:tabs>
-          <w:tab w:val="clear" w:pos="709"/>
           <w:tab w:val="left" w:pos="709" w:leader="none"/>
         </w:tabs>
         <w:bidi w:val="0"/>
@@ -9772,7 +9756,6 @@
           <w:numId w:val="12"/>
         </w:numPr>
         <w:tabs>
-          <w:tab w:val="clear" w:pos="709"/>
           <w:tab w:val="left" w:pos="709" w:leader="none"/>
         </w:tabs>
         <w:bidi w:val="0"/>
@@ -9807,7 +9790,6 @@
           <w:numId w:val="12"/>
         </w:numPr>
         <w:tabs>
-          <w:tab w:val="clear" w:pos="709"/>
           <w:tab w:val="left" w:pos="709" w:leader="none"/>
         </w:tabs>
         <w:bidi w:val="0"/>
@@ -9842,7 +9824,6 @@
           <w:numId w:val="12"/>
         </w:numPr>
         <w:tabs>
-          <w:tab w:val="clear" w:pos="709"/>
           <w:tab w:val="left" w:pos="709" w:leader="none"/>
         </w:tabs>
         <w:bidi w:val="0"/>
@@ -9877,7 +9858,6 @@
           <w:numId w:val="12"/>
         </w:numPr>
         <w:tabs>
-          <w:tab w:val="clear" w:pos="709"/>
           <w:tab w:val="left" w:pos="709" w:leader="none"/>
         </w:tabs>
         <w:bidi w:val="0"/>
@@ -9912,7 +9892,6 @@
           <w:numId w:val="12"/>
         </w:numPr>
         <w:tabs>
-          <w:tab w:val="clear" w:pos="709"/>
           <w:tab w:val="left" w:pos="709" w:leader="none"/>
         </w:tabs>
         <w:bidi w:val="0"/>
@@ -9947,7 +9926,6 @@
           <w:numId w:val="12"/>
         </w:numPr>
         <w:tabs>
-          <w:tab w:val="clear" w:pos="709"/>
           <w:tab w:val="left" w:pos="709" w:leader="none"/>
         </w:tabs>
         <w:bidi w:val="0"/>
@@ -9982,7 +9960,6 @@
           <w:numId w:val="12"/>
         </w:numPr>
         <w:tabs>
-          <w:tab w:val="clear" w:pos="709"/>
           <w:tab w:val="left" w:pos="709" w:leader="none"/>
         </w:tabs>
         <w:bidi w:val="0"/>
@@ -10017,7 +9994,6 @@
           <w:numId w:val="12"/>
         </w:numPr>
         <w:tabs>
-          <w:tab w:val="clear" w:pos="709"/>
           <w:tab w:val="left" w:pos="709" w:leader="none"/>
         </w:tabs>
         <w:bidi w:val="0"/>
@@ -10052,7 +10028,6 @@
           <w:numId w:val="12"/>
         </w:numPr>
         <w:tabs>
-          <w:tab w:val="clear" w:pos="709"/>
           <w:tab w:val="left" w:pos="709" w:leader="none"/>
         </w:tabs>
         <w:bidi w:val="0"/>
@@ -10087,7 +10062,6 @@
           <w:numId w:val="12"/>
         </w:numPr>
         <w:tabs>
-          <w:tab w:val="clear" w:pos="709"/>
           <w:tab w:val="left" w:pos="709" w:leader="none"/>
         </w:tabs>
         <w:bidi w:val="0"/>
@@ -11158,7 +11132,6 @@
           <w:numId w:val="13"/>
         </w:numPr>
         <w:tabs>
-          <w:tab w:val="clear" w:pos="709"/>
           <w:tab w:val="left" w:pos="709" w:leader="none"/>
         </w:tabs>
         <w:bidi w:val="0"/>
@@ -11208,7 +11181,6 @@
           <w:numId w:val="13"/>
         </w:numPr>
         <w:tabs>
-          <w:tab w:val="clear" w:pos="709"/>
           <w:tab w:val="left" w:pos="709" w:leader="none"/>
         </w:tabs>
         <w:bidi w:val="0"/>
@@ -11243,7 +11215,6 @@
           <w:numId w:val="13"/>
         </w:numPr>
         <w:tabs>
-          <w:tab w:val="clear" w:pos="709"/>
           <w:tab w:val="left" w:pos="709" w:leader="none"/>
         </w:tabs>
         <w:bidi w:val="0"/>
@@ -11278,7 +11249,6 @@
           <w:numId w:val="13"/>
         </w:numPr>
         <w:tabs>
-          <w:tab w:val="clear" w:pos="709"/>
           <w:tab w:val="left" w:pos="709" w:leader="none"/>
         </w:tabs>
         <w:bidi w:val="0"/>
@@ -11313,7 +11283,6 @@
           <w:numId w:val="13"/>
         </w:numPr>
         <w:tabs>
-          <w:tab w:val="clear" w:pos="709"/>
           <w:tab w:val="left" w:pos="709" w:leader="none"/>
         </w:tabs>
         <w:bidi w:val="0"/>
@@ -11348,7 +11317,6 @@
           <w:numId w:val="13"/>
         </w:numPr>
         <w:tabs>
-          <w:tab w:val="clear" w:pos="709"/>
           <w:tab w:val="left" w:pos="709" w:leader="none"/>
         </w:tabs>
         <w:bidi w:val="0"/>
@@ -11622,7 +11590,7 @@
     </w:p>
     <w:p>
       <w:pPr>
-        <w:pStyle w:val="BlockQuotation"/>
+        <w:pStyle w:val="BlockQuotationuser"/>
         <w:bidi w:val="0"/>
         <w:jc w:val="start"/>
         <w:rPr>
@@ -11772,7 +11740,7 @@
     </w:p>
     <w:p>
       <w:pPr>
-        <w:pStyle w:val="BlockQuotation"/>
+        <w:pStyle w:val="BlockQuotationuser"/>
         <w:bidi w:val="0"/>
         <w:jc w:val="start"/>
         <w:rPr>
@@ -12057,7 +12025,6 @@
           <w:numId w:val="14"/>
         </w:numPr>
         <w:tabs>
-          <w:tab w:val="clear" w:pos="709"/>
           <w:tab w:val="left" w:pos="709" w:leader="none"/>
         </w:tabs>
         <w:bidi w:val="0"/>
@@ -12084,7 +12051,6 @@
           <w:numId w:val="14"/>
         </w:numPr>
         <w:tabs>
-          <w:tab w:val="clear" w:pos="709"/>
           <w:tab w:val="left" w:pos="709" w:leader="none"/>
         </w:tabs>
         <w:bidi w:val="0"/>
@@ -12141,7 +12107,6 @@
           <w:numId w:val="14"/>
         </w:numPr>
         <w:tabs>
-          <w:tab w:val="clear" w:pos="709"/>
           <w:tab w:val="left" w:pos="709" w:leader="none"/>
         </w:tabs>
         <w:bidi w:val="0"/>
@@ -12168,7 +12133,6 @@
           <w:numId w:val="14"/>
         </w:numPr>
         <w:tabs>
-          <w:tab w:val="clear" w:pos="709"/>
           <w:tab w:val="left" w:pos="709" w:leader="none"/>
         </w:tabs>
         <w:bidi w:val="0"/>
@@ -12195,7 +12159,6 @@
           <w:numId w:val="14"/>
         </w:numPr>
         <w:tabs>
-          <w:tab w:val="clear" w:pos="709"/>
           <w:tab w:val="left" w:pos="709" w:leader="none"/>
         </w:tabs>
         <w:bidi w:val="0"/>
@@ -12222,7 +12185,6 @@
           <w:numId w:val="14"/>
         </w:numPr>
         <w:tabs>
-          <w:tab w:val="clear" w:pos="709"/>
           <w:tab w:val="left" w:pos="709" w:leader="none"/>
         </w:tabs>
         <w:bidi w:val="0"/>
@@ -12249,7 +12211,6 @@
           <w:numId w:val="14"/>
         </w:numPr>
         <w:tabs>
-          <w:tab w:val="clear" w:pos="709"/>
           <w:tab w:val="left" w:pos="709" w:leader="none"/>
         </w:tabs>
         <w:bidi w:val="0"/>
@@ -12276,7 +12237,6 @@
           <w:numId w:val="14"/>
         </w:numPr>
         <w:tabs>
-          <w:tab w:val="clear" w:pos="709"/>
           <w:tab w:val="left" w:pos="709" w:leader="none"/>
         </w:tabs>
         <w:bidi w:val="0"/>
@@ -12303,7 +12263,6 @@
           <w:numId w:val="14"/>
         </w:numPr>
         <w:tabs>
-          <w:tab w:val="clear" w:pos="709"/>
           <w:tab w:val="left" w:pos="709" w:leader="none"/>
         </w:tabs>
         <w:bidi w:val="0"/>
@@ -12330,7 +12289,6 @@
           <w:numId w:val="14"/>
         </w:numPr>
         <w:tabs>
-          <w:tab w:val="clear" w:pos="709"/>
           <w:tab w:val="left" w:pos="709" w:leader="none"/>
         </w:tabs>
         <w:bidi w:val="0"/>
@@ -12357,7 +12315,6 @@
           <w:numId w:val="14"/>
         </w:numPr>
         <w:tabs>
-          <w:tab w:val="clear" w:pos="709"/>
           <w:tab w:val="left" w:pos="709" w:leader="none"/>
         </w:tabs>
         <w:bidi w:val="0"/>
@@ -12384,7 +12341,6 @@
           <w:numId w:val="14"/>
         </w:numPr>
         <w:tabs>
-          <w:tab w:val="clear" w:pos="709"/>
           <w:tab w:val="left" w:pos="709" w:leader="none"/>
         </w:tabs>
         <w:bidi w:val="0"/>
@@ -12411,7 +12367,6 @@
           <w:numId w:val="14"/>
         </w:numPr>
         <w:tabs>
-          <w:tab w:val="clear" w:pos="709"/>
           <w:tab w:val="left" w:pos="709" w:leader="none"/>
         </w:tabs>
         <w:bidi w:val="0"/>
@@ -12438,7 +12393,6 @@
           <w:numId w:val="14"/>
         </w:numPr>
         <w:tabs>
-          <w:tab w:val="clear" w:pos="709"/>
           <w:tab w:val="left" w:pos="709" w:leader="none"/>
         </w:tabs>
         <w:bidi w:val="0"/>
@@ -12694,6 +12648,7 @@
       <w:pPr>
         <w:pStyle w:val="Normal"/>
         <w:bidi w:val="0"/>
+        <w:spacing w:before="0" w:after="0"/>
         <w:jc w:val="start"/>
         <w:rPr>
           <w:sz w:val="16"/>
@@ -12714,6 +12669,7 @@
       <w:pgNumType w:fmt="decimal"/>
       <w:formProt w:val="false"/>
       <w:textDirection w:val="lrTb"/>
+      <w:docGrid w:type="default" w:linePitch="100" w:charSpace="0"/>
     </w:sectPr>
   </w:body>
 </w:document>
@@ -14643,7 +14599,6 @@
     <w:lvl w:ilvl="0">
       <w:start w:val="1"/>
       <w:numFmt w:val="none"/>
-      <w:pStyle w:val="Heading1"/>
       <w:suff w:val="nothing"/>
       <w:lvlText w:val=""/>
       <w:lvlJc w:val="start"/>
@@ -14657,7 +14612,6 @@
     <w:lvl w:ilvl="1">
       <w:start w:val="1"/>
       <w:numFmt w:val="none"/>
-      <w:pStyle w:val="Heading2"/>
       <w:suff w:val="nothing"/>
       <w:lvlText w:val=""/>
       <w:lvlJc w:val="start"/>
@@ -14684,7 +14638,6 @@
     <w:lvl w:ilvl="3">
       <w:start w:val="1"/>
       <w:numFmt w:val="none"/>
-      <w:pStyle w:val="Heading4"/>
       <w:suff w:val="nothing"/>
       <w:lvlText w:val=""/>
       <w:lvlJc w:val="start"/>
@@ -14823,7 +14776,6 @@
     </w:rPrDefault>
     <w:pPrDefault>
       <w:pPr>
-        <w:widowControl/>
         <w:suppressAutoHyphens w:val="true"/>
       </w:pPr>
     </w:pPrDefault>
@@ -14833,7 +14785,10 @@
     <w:qFormat/>
     <w:pPr>
       <w:widowControl/>
+      <w:suppressAutoHyphens w:val="true"/>
       <w:bidi w:val="0"/>
+      <w:spacing w:before="0" w:after="0"/>
+      <w:jc w:val="start"/>
     </w:pPr>
     <w:rPr>
       <w:rFonts w:ascii="Liberation Serif" w:hAnsi="Liberation Serif" w:eastAsia="Noto Sans" w:cs="FreeSans"/>
@@ -14918,8 +14873,8 @@
       <w:u w:val="single"/>
     </w:rPr>
   </w:style>
-  <w:style w:type="character" w:styleId="Bullets">
-    <w:name w:val="Bullets"/>
+  <w:style w:type="character" w:styleId="Bulletsuser">
+    <w:name w:val="Bullets (user)"/>
     <w:qFormat/>
     <w:rPr>
       <w:rFonts w:ascii="OpenSymbol" w:hAnsi="OpenSymbol" w:eastAsia="OpenSymbol" w:cs="OpenSymbol"/>
@@ -14930,6 +14885,13 @@
     <w:qFormat/>
     <w:rPr>
       <w:rFonts w:ascii="Liberation Mono" w:hAnsi="Liberation Mono" w:eastAsia="Liberation Mono" w:cs="Liberation Mono"/>
+    </w:rPr>
+  </w:style>
+  <w:style w:type="character" w:styleId="FollowedHyperlink">
+    <w:name w:val="FollowedHyperlink"/>
+    <w:rPr>
+      <w:color w:val="800000"/>
+      <w:u w:val="single"/>
     </w:rPr>
   </w:style>
   <w:style w:type="paragraph" w:styleId="Heading">
@@ -14990,8 +14952,8 @@
       <w:rFonts w:cs="FreeSans"/>
     </w:rPr>
   </w:style>
-  <w:style w:type="paragraph" w:styleId="BlockQuotation">
-    <w:name w:val="Block Quotation"/>
+  <w:style w:type="paragraph" w:styleId="BlockQuotationuser">
+    <w:name w:val="Block Quotation (user)"/>
     <w:basedOn w:val="Normal"/>
     <w:qFormat/>
     <w:pPr>

</xml_diff>